<commit_message>
updated create test and train data to add to basic dataset too...
</commit_message>
<xml_diff>
--- a/docs/Football Predictor Plan.docx
+++ b/docs/Football Predictor Plan.docx
@@ -723,7 +723,19 @@
         <w:rPr>
           <w:lang w:val="en-GB"/>
         </w:rPr>
-        <w:t xml:space="preserve">This would hopefully capture the difference between playing at home vs away. </w:t>
+        <w:t>This would hopefully capture the difference between playing at home vs away</w:t>
+      </w:r>
+      <w:r>
+        <w:rPr>
+          <w:lang w:val="en-GB"/>
+        </w:rPr>
+        <w:t xml:space="preserve"> as well as the other</w:t>
+      </w:r>
+      <w:r>
+        <w:rPr>
+          <w:lang w:val="en-GB"/>
+        </w:rPr>
+        <w:t xml:space="preserve"> factors I mentioned previously.</w:t>
       </w:r>
     </w:p>
     <w:p>
@@ -763,7 +775,19 @@
         <w:rPr>
           <w:lang w:val="en-GB"/>
         </w:rPr>
-        <w:t xml:space="preserve">To show this relationship is being picked up </w:t>
+        <w:t>To show</w:t>
+      </w:r>
+      <w:r>
+        <w:rPr>
+          <w:lang w:val="en-GB"/>
+        </w:rPr>
+        <w:t xml:space="preserve"> that the home/away</w:t>
+      </w:r>
+      <w:r>
+        <w:rPr>
+          <w:lang w:val="en-GB"/>
+        </w:rPr>
+        <w:t xml:space="preserve"> relationship is being picked up </w:t>
       </w:r>
       <w:r>
         <w:rPr>
@@ -1029,7 +1053,19 @@
         <w:rPr>
           <w:lang w:val="en-GB"/>
         </w:rPr>
-        <w:t xml:space="preserve"> (54% accuracy) it is picking up on some important factors however it could be improved. Let’s compare the 54% accuracy to some baseline models:</w:t>
+        <w:t xml:space="preserve"> (5</w:t>
+      </w:r>
+      <w:r>
+        <w:rPr>
+          <w:lang w:val="en-GB"/>
+        </w:rPr>
+        <w:t>3</w:t>
+      </w:r>
+      <w:r>
+        <w:rPr>
+          <w:lang w:val="en-GB"/>
+        </w:rPr>
+        <w:t>% accuracy) it is picking up on some important factors however it could be improved. Let’s compare the 54% accuracy to some baseline models:</w:t>
       </w:r>
     </w:p>
     <w:p>
@@ -1064,38 +1100,50 @@
         </w:rPr>
         <w:t>Only using basic recent form stats:</w:t>
       </w:r>
-    </w:p>
-    <w:p>
-      <w:pPr>
-        <w:rPr>
-          <w:lang w:val="en-GB"/>
-        </w:rPr>
-      </w:pPr>
-      <w:r>
-        <w:rPr>
-          <w:lang w:val="en-GB"/>
-        </w:rPr>
-        <w:t>Sports enthusiasts predictions on my data.</w:t>
-      </w:r>
-    </w:p>
-    <w:p>
-      <w:pPr>
-        <w:rPr>
-          <w:lang w:val="en-GB"/>
-        </w:rPr>
-      </w:pPr>
-    </w:p>
-    <w:p>
-      <w:pPr>
-        <w:rPr>
-          <w:lang w:val="en-GB"/>
-        </w:rPr>
-      </w:pPr>
-      <w:r>
-        <w:rPr>
-          <w:lang w:val="en-GB"/>
-        </w:rPr>
-        <w:t>Further improvements</w:t>
+      <w:r>
+        <w:rPr>
+          <w:lang w:val="en-GB"/>
+        </w:rPr>
+        <w:t xml:space="preserve"> </w:t>
+      </w:r>
+    </w:p>
+    <w:p>
+      <w:pPr>
+        <w:rPr>
+          <w:lang w:val="en-GB"/>
+        </w:rPr>
+      </w:pPr>
+      <w:r>
+        <w:rPr>
+          <w:lang w:val="en-GB"/>
+        </w:rPr>
+        <w:t>Sports enthusiasts predictions on my data</w:t>
+      </w:r>
+      <w:r>
+        <w:rPr>
+          <w:lang w:val="en-GB"/>
+        </w:rPr>
+        <w:t xml:space="preserve"> = 40%</w:t>
+      </w:r>
+    </w:p>
+    <w:p>
+      <w:pPr>
+        <w:rPr>
+          <w:lang w:val="en-GB"/>
+        </w:rPr>
+      </w:pPr>
+    </w:p>
+    <w:p>
+      <w:pPr>
+        <w:rPr>
+          <w:lang w:val="en-GB"/>
+        </w:rPr>
+      </w:pPr>
+      <w:r>
+        <w:rPr>
+          <w:lang w:val="en-GB"/>
+        </w:rPr>
+        <w:t>Next steps</w:t>
       </w:r>
     </w:p>
     <w:p>
@@ -1164,7 +1212,7 @@
         <w:rPr>
           <w:lang w:val="en-GB"/>
         </w:rPr>
-        <w:t>Momentum/Recent form trend</w:t>
+        <w:t>Manager</w:t>
       </w:r>
     </w:p>
     <w:p>
@@ -1182,7 +1230,7 @@
         <w:rPr>
           <w:lang w:val="en-GB"/>
         </w:rPr>
-        <w:t>Referee impact</w:t>
+        <w:t>Weather and pitch conditions</w:t>
       </w:r>
     </w:p>
     <w:p>
@@ -1200,7 +1248,79 @@
         <w:rPr>
           <w:lang w:val="en-GB"/>
         </w:rPr>
-        <w:t>Weather and pitch conditions</w:t>
+        <w:t>Stage of the season</w:t>
+      </w:r>
+      <w:r>
+        <w:rPr>
+          <w:lang w:val="en-GB"/>
+        </w:rPr>
+        <w:t xml:space="preserve"> – Start time compared to start and end of usual season…</w:t>
+      </w:r>
+    </w:p>
+    <w:p>
+      <w:pPr>
+        <w:pStyle w:val="ListParagraph"/>
+        <w:numPr>
+          <w:ilvl w:val="0"/>
+          <w:numId w:val="4"/>
+        </w:numPr>
+        <w:rPr>
+          <w:lang w:val="en-GB"/>
+        </w:rPr>
+      </w:pPr>
+      <w:r>
+        <w:rPr>
+          <w:lang w:val="en-GB"/>
+        </w:rPr>
+        <w:t>Momentum/Recent form trend – DONE</w:t>
+      </w:r>
+    </w:p>
+    <w:p>
+      <w:pPr>
+        <w:pStyle w:val="ListParagraph"/>
+        <w:numPr>
+          <w:ilvl w:val="0"/>
+          <w:numId w:val="4"/>
+        </w:numPr>
+        <w:rPr>
+          <w:lang w:val="en-GB"/>
+        </w:rPr>
+      </w:pPr>
+      <w:r>
+        <w:rPr>
+          <w:lang w:val="en-GB"/>
+        </w:rPr>
+        <w:t>Referee impact – DONE</w:t>
+      </w:r>
+    </w:p>
+    <w:p>
+      <w:pPr>
+        <w:pStyle w:val="ListParagraph"/>
+        <w:numPr>
+          <w:ilvl w:val="0"/>
+          <w:numId w:val="4"/>
+        </w:numPr>
+        <w:rPr>
+          <w:lang w:val="en-GB"/>
+        </w:rPr>
+      </w:pPr>
+      <w:r>
+        <w:rPr>
+          <w:lang w:val="en-GB"/>
+        </w:rPr>
+        <w:t>ELO score</w:t>
+      </w:r>
+      <w:r>
+        <w:rPr>
+          <w:lang w:val="en-GB"/>
+        </w:rPr>
+        <w:t xml:space="preserve"> –</w:t>
+      </w:r>
+      <w:r>
+        <w:rPr>
+          <w:lang w:val="en-GB"/>
+        </w:rPr>
+        <w:t xml:space="preserve"> DONE</w:t>
       </w:r>
     </w:p>
     <w:p>
@@ -1263,6 +1383,163 @@
         </w:rPr>
         <w:t xml:space="preserve"> A team with amazing recent form against weak opponents differs to that of the same form against strong opponents. Something to consider (Keep a team strength variable based on their matches across various opponents)</w:t>
       </w:r>
+      <w:r>
+        <w:rPr>
+          <w:lang w:val="en-GB"/>
+        </w:rPr>
+        <w:t xml:space="preserve"> DONE</w:t>
+      </w:r>
+      <w:r>
+        <w:rPr>
+          <w:lang w:val="en-GB"/>
+        </w:rPr>
+        <w:br/>
+      </w:r>
+      <w:r>
+        <w:rPr>
+          <w:lang w:val="en-GB"/>
+        </w:rPr>
+        <w:br/>
+      </w:r>
+      <w:r>
+        <w:rPr>
+          <w:lang w:val="en-GB"/>
+        </w:rPr>
+        <w:br/>
+        <w:t>Evaluation of the results</w:t>
+      </w:r>
+      <w:r>
+        <w:rPr>
+          <w:lang w:val="en-GB"/>
+        </w:rPr>
+        <w:br/>
+      </w:r>
+      <w:r>
+        <w:rPr>
+          <w:lang w:val="en-GB"/>
+        </w:rPr>
+        <w:br/>
+        <w:t>With the addition of the ELO score feature. I have the following results using logistic regression:</w:t>
+      </w:r>
+    </w:p>
+    <w:p>
+      <w:pPr>
+        <w:rPr>
+          <w:lang w:val="en-GB"/>
+        </w:rPr>
+      </w:pPr>
+      <w:r>
+        <w:rPr>
+          <w:lang w:val="en-GB"/>
+        </w:rPr>
+        <w:br/>
+      </w:r>
+      <w:r>
+        <w:rPr>
+          <w:noProof/>
+          <w:lang w:val="en-GB"/>
+        </w:rPr>
+        <w:drawing>
+          <wp:inline distT="0" distB="0" distL="0" distR="0" wp14:anchorId="323DABA4" wp14:editId="0658C43C">
+            <wp:extent cx="5731510" cy="885190"/>
+            <wp:effectExtent l="0" t="0" r="0" b="3810"/>
+            <wp:docPr id="1494495329" name="Picture 1" descr="A black and white screen with white text&#10;&#10;Description automatically generated"/>
+            <wp:cNvGraphicFramePr>
+              <a:graphicFrameLocks xmlns:a="http://schemas.openxmlformats.org/drawingml/2006/main" noChangeAspect="1"/>
+            </wp:cNvGraphicFramePr>
+            <a:graphic xmlns:a="http://schemas.openxmlformats.org/drawingml/2006/main">
+              <a:graphicData uri="http://schemas.openxmlformats.org/drawingml/2006/picture">
+                <pic:pic xmlns:pic="http://schemas.openxmlformats.org/drawingml/2006/picture">
+                  <pic:nvPicPr>
+                    <pic:cNvPr id="1494495329" name="Picture 1" descr="A black and white screen with white text&#10;&#10;Description automatically generated"/>
+                    <pic:cNvPicPr/>
+                  </pic:nvPicPr>
+                  <pic:blipFill>
+                    <a:blip r:embed="rId5">
+                      <a:extLst>
+                        <a:ext uri="{28A0092B-C50C-407E-A947-70E740481C1C}">
+                          <a14:useLocalDpi xmlns:a14="http://schemas.microsoft.com/office/drawing/2010/main" val="0"/>
+                        </a:ext>
+                      </a:extLst>
+                    </a:blip>
+                    <a:stretch>
+                      <a:fillRect/>
+                    </a:stretch>
+                  </pic:blipFill>
+                  <pic:spPr>
+                    <a:xfrm>
+                      <a:off x="0" y="0"/>
+                      <a:ext cx="5731510" cy="885190"/>
+                    </a:xfrm>
+                    <a:prstGeom prst="rect">
+                      <a:avLst/>
+                    </a:prstGeom>
+                  </pic:spPr>
+                </pic:pic>
+              </a:graphicData>
+            </a:graphic>
+          </wp:inline>
+        </w:drawing>
+      </w:r>
+      <w:r>
+        <w:rPr>
+          <w:lang w:val="en-GB"/>
+        </w:rPr>
+        <w:br/>
+      </w:r>
+    </w:p>
+    <w:p>
+      <w:pPr>
+        <w:rPr>
+          <w:rFonts w:ascii="inherit" w:eastAsia="Times New Roman" w:hAnsi="inherit" w:cs="Arial"/>
+          <w:color w:val="D1D1D1"/>
+          <w:sz w:val="20"/>
+          <w:szCs w:val="20"/>
+          <w:lang w:val="en-GB" w:eastAsia="en-GB"/>
+        </w:rPr>
+      </w:pPr>
+    </w:p>
+    <w:p>
+      <w:pPr>
+        <w:rPr>
+          <w:lang w:val="en-GB"/>
+        </w:rPr>
+      </w:pPr>
+    </w:p>
+    <w:p>
+      <w:pPr>
+        <w:rPr>
+          <w:lang w:val="en-GB"/>
+        </w:rPr>
+      </w:pPr>
+    </w:p>
+    <w:p>
+      <w:pPr>
+        <w:rPr>
+          <w:lang w:val="en-GB"/>
+        </w:rPr>
+      </w:pPr>
+    </w:p>
+    <w:p>
+      <w:pPr>
+        <w:rPr>
+          <w:lang w:val="en-GB"/>
+        </w:rPr>
+      </w:pPr>
+    </w:p>
+    <w:p>
+      <w:pPr>
+        <w:rPr>
+          <w:lang w:val="en-GB"/>
+        </w:rPr>
+      </w:pPr>
+    </w:p>
+    <w:p>
+      <w:pPr>
+        <w:rPr>
+          <w:lang w:val="en-GB"/>
+        </w:rPr>
+      </w:pPr>
     </w:p>
     <w:p>
       <w:pPr>
@@ -2701,6 +2978,11 @@
       <w:spacing w:val="5"/>
     </w:rPr>
   </w:style>
+  <w:style w:type="character" w:customStyle="1" w:styleId="anysphere-markdown-container-root">
+    <w:name w:val="anysphere-markdown-container-root"/>
+    <w:basedOn w:val="DefaultParagraphFont"/>
+    <w:rsid w:val="0037332D"/>
+  </w:style>
 </w:styles>
 </file>
 

</xml_diff>